<commit_message>
Add updated docs for iteration 3; Update README.md with deployment details.
</commit_message>
<xml_diff>
--- a/doc/CS673_SDD_team3.docx
+++ b/doc/CS673_SDD_team3.docx
@@ -19,6 +19,7 @@
         <w:jc w:val="center"/>
         <w:rPr>
           <w:b w:val="1"/>
+          <w:bCs w:val="1"/>
           <w:sz w:val="24"/>
           <w:szCs w:val="24"/>
           <w:u w:val="single"/>
@@ -27,6 +28,7 @@
       <w:r>
         <w:rPr>
           <w:b w:val="1"/>
+          <w:bCs w:val="1"/>
           <w:sz w:val="24"/>
           <w:szCs w:val="24"/>
           <w:u w:val="single"/>
@@ -47,12 +49,12 @@
             <wp:extent cx="1133475" cy="847725"/>
             <wp:effectExtent b="0" l="0" r="0" t="0"/>
             <wp:wrapSquare wrapText="bothSides" distB="19050" distT="19050" distL="19050" distR="19050"/>
-            <wp:docPr id="10" name="image6.png"/>
+            <wp:docPr id="5" name="image5.png"/>
             <a:graphic>
               <a:graphicData uri="http://schemas.openxmlformats.org/drawingml/2006/picture">
                 <pic:pic>
                   <pic:nvPicPr>
-                    <pic:cNvPr id="0" name="image6.png"/>
+                    <pic:cNvPr id="0" name="image5.png"/>
                     <pic:cNvPicPr preferRelativeResize="0"/>
                   </pic:nvPicPr>
                   <pic:blipFill>
@@ -94,6 +96,7 @@
         <w:jc w:val="center"/>
         <w:rPr>
           <w:b w:val="1"/>
+          <w:bCs w:val="1"/>
           <w:sz w:val="24"/>
           <w:szCs w:val="24"/>
           <w:u w:val="single"/>
@@ -102,6 +105,7 @@
       <w:r>
         <w:rPr>
           <w:b w:val="1"/>
+          <w:bCs w:val="1"/>
           <w:sz w:val="24"/>
           <w:szCs w:val="24"/>
           <w:u w:val="single"/>
@@ -112,6 +116,7 @@
       <w:r>
         <w:rPr>
           <w:b w:val="1"/>
+          <w:bCs w:val="1"/>
           <w:sz w:val="24"/>
           <w:szCs w:val="24"/>
           <w:u w:val="single"/>
@@ -137,6 +142,7 @@
         <w:jc w:val="center"/>
         <w:rPr>
           <w:b w:val="1"/>
+          <w:bCs w:val="1"/>
           <w:sz w:val="24"/>
           <w:szCs w:val="24"/>
           <w:u w:val="single"/>
@@ -145,6 +151,7 @@
       <w:r>
         <w:rPr>
           <w:b w:val="1"/>
+          <w:bCs w:val="1"/>
           <w:sz w:val="24"/>
           <w:szCs w:val="24"/>
           <w:u w:val="single"/>
@@ -169,6 +176,7 @@
         <w:shd w:fill="auto" w:val="clear"/>
         <w:rPr>
           <w:b w:val="1"/>
+          <w:bCs w:val="1"/>
           <w:sz w:val="24"/>
           <w:szCs w:val="24"/>
           <w:u w:val="single"/>
@@ -197,6 +205,7 @@
         <w:jc w:val="center"/>
         <w:rPr>
           <w:b w:val="1"/>
+          <w:bCs w:val="1"/>
           <w:sz w:val="24"/>
           <w:szCs w:val="24"/>
           <w:u w:val="single"/>
@@ -538,6 +547,7 @@
               <w:ind w:left="0" w:firstLine="0"/>
               <w:rPr>
                 <w:i w:val="1"/>
+                <w:iCs w:val="1"/>
                 <w:sz w:val="24"/>
                 <w:szCs w:val="24"/>
                 <w:u w:val="single"/>
@@ -546,6 +556,7 @@
             <w:r>
               <w:rPr>
                 <w:i w:val="1"/>
+                <w:iCs w:val="1"/>
                 <w:sz w:val="24"/>
                 <w:szCs w:val="24"/>
                 <w:u w:val="single"/>
@@ -717,6 +728,7 @@
               <w:ind w:left="0" w:firstLine="0"/>
               <w:rPr>
                 <w:i w:val="1"/>
+                <w:iCs w:val="1"/>
                 <w:sz w:val="24"/>
                 <w:szCs w:val="24"/>
                 <w:u w:val="single"/>
@@ -725,6 +737,7 @@
             <w:r>
               <w:rPr>
                 <w:i w:val="1"/>
+                <w:iCs w:val="1"/>
                 <w:sz w:val="24"/>
                 <w:szCs w:val="24"/>
                 <w:u w:val="single"/>
@@ -884,6 +897,7 @@
               <w:ind w:left="0" w:firstLine="0"/>
               <w:rPr>
                 <w:i w:val="1"/>
+                <w:iCs w:val="1"/>
                 <w:sz w:val="24"/>
                 <w:szCs w:val="24"/>
                 <w:u w:val="single"/>
@@ -892,6 +906,7 @@
             <w:r>
               <w:rPr>
                 <w:i w:val="1"/>
+                <w:iCs w:val="1"/>
                 <w:sz w:val="24"/>
                 <w:szCs w:val="24"/>
                 <w:u w:val="single"/>
@@ -1063,6 +1078,7 @@
               <w:ind w:left="0" w:firstLine="0"/>
               <w:rPr>
                 <w:i w:val="1"/>
+                <w:iCs w:val="1"/>
                 <w:sz w:val="24"/>
                 <w:szCs w:val="24"/>
                 <w:u w:val="single"/>
@@ -1071,6 +1087,7 @@
             <w:r>
               <w:rPr>
                 <w:i w:val="1"/>
+                <w:iCs w:val="1"/>
                 <w:sz w:val="24"/>
                 <w:szCs w:val="24"/>
                 <w:u w:val="single"/>
@@ -1218,6 +1235,7 @@
               <w:ind w:left="0" w:firstLine="0"/>
               <w:rPr>
                 <w:i w:val="1"/>
+                <w:iCs w:val="1"/>
                 <w:sz w:val="24"/>
                 <w:szCs w:val="24"/>
                 <w:u w:val="single"/>
@@ -1226,6 +1244,7 @@
             <w:r>
               <w:rPr>
                 <w:i w:val="1"/>
+                <w:iCs w:val="1"/>
                 <w:sz w:val="24"/>
                 <w:szCs w:val="24"/>
                 <w:u w:val="single"/>
@@ -1402,7 +1421,9 @@
               <w:rPr>
                 <w:rFonts w:ascii="Arial" w:cs="Arial" w:eastAsia="Arial" w:hAnsi="Arial"/>
                 <w:b w:val="0"/>
+                <w:bCs w:val="0"/>
                 <w:i w:val="1"/>
+                <w:iCs w:val="1"/>
                 <w:smallCaps w:val="0"/>
                 <w:strike w:val="0"/>
                 <w:color w:val="000000"/>
@@ -1416,6 +1437,7 @@
             <w:r>
               <w:rPr>
                 <w:i w:val="1"/>
+                <w:iCs w:val="1"/>
                 <w:sz w:val="24"/>
                 <w:szCs w:val="24"/>
                 <w:u w:val="single"/>
@@ -1461,7 +1483,9 @@
               <w:rPr>
                 <w:rFonts w:ascii="Arial" w:cs="Arial" w:eastAsia="Arial" w:hAnsi="Arial"/>
                 <w:b w:val="0"/>
+                <w:bCs w:val="0"/>
                 <w:i w:val="0"/>
+                <w:iCs w:val="0"/>
                 <w:smallCaps w:val="0"/>
                 <w:strike w:val="0"/>
                 <w:color w:val="000000"/>
@@ -1563,7 +1587,9 @@
               <w:rPr>
                 <w:rFonts w:ascii="Arial" w:cs="Arial" w:eastAsia="Arial" w:hAnsi="Arial"/>
                 <w:b w:val="0"/>
+                <w:bCs w:val="0"/>
                 <w:i w:val="0"/>
+                <w:iCs w:val="0"/>
                 <w:smallCaps w:val="0"/>
                 <w:strike w:val="0"/>
                 <w:color w:val="000000"/>
@@ -1611,7 +1637,9 @@
               <w:rPr>
                 <w:rFonts w:ascii="Arial" w:cs="Arial" w:eastAsia="Arial" w:hAnsi="Arial"/>
                 <w:b w:val="0"/>
+                <w:bCs w:val="0"/>
                 <w:i w:val="1"/>
+                <w:iCs w:val="1"/>
                 <w:smallCaps w:val="0"/>
                 <w:strike w:val="0"/>
                 <w:color w:val="000000"/>
@@ -1660,7 +1688,9 @@
               <w:rPr>
                 <w:rFonts w:ascii="Arial" w:cs="Arial" w:eastAsia="Arial" w:hAnsi="Arial"/>
                 <w:b w:val="0"/>
+                <w:bCs w:val="0"/>
                 <w:i w:val="0"/>
+                <w:iCs w:val="0"/>
                 <w:smallCaps w:val="0"/>
                 <w:strike w:val="0"/>
                 <w:color w:val="000000"/>
@@ -1753,7 +1783,9 @@
               <w:rPr>
                 <w:rFonts w:ascii="Arial" w:cs="Arial" w:eastAsia="Arial" w:hAnsi="Arial"/>
                 <w:b w:val="0"/>
+                <w:bCs w:val="0"/>
                 <w:i w:val="0"/>
+                <w:iCs w:val="0"/>
                 <w:smallCaps w:val="0"/>
                 <w:strike w:val="0"/>
                 <w:color w:val="000000"/>
@@ -1801,7 +1833,9 @@
               <w:rPr>
                 <w:rFonts w:ascii="Arial" w:cs="Arial" w:eastAsia="Arial" w:hAnsi="Arial"/>
                 <w:b w:val="0"/>
+                <w:bCs w:val="0"/>
                 <w:i w:val="1"/>
+                <w:iCs w:val="1"/>
                 <w:smallCaps w:val="0"/>
                 <w:strike w:val="0"/>
                 <w:color w:val="000000"/>
@@ -1850,7 +1884,9 @@
               <w:rPr>
                 <w:rFonts w:ascii="Arial" w:cs="Arial" w:eastAsia="Arial" w:hAnsi="Arial"/>
                 <w:b w:val="0"/>
+                <w:bCs w:val="0"/>
                 <w:i w:val="0"/>
+                <w:iCs w:val="0"/>
                 <w:smallCaps w:val="0"/>
                 <w:strike w:val="0"/>
                 <w:color w:val="000000"/>
@@ -1912,6 +1948,7 @@
         <w:shd w:fill="auto" w:val="clear"/>
         <w:rPr>
           <w:b w:val="1"/>
+          <w:bCs w:val="1"/>
           <w:sz w:val="24"/>
           <w:szCs w:val="24"/>
           <w:u w:val="single"/>
@@ -1920,6 +1957,7 @@
       <w:r>
         <w:rPr>
           <w:b w:val="1"/>
+          <w:bCs w:val="1"/>
           <w:sz w:val="24"/>
           <w:szCs w:val="24"/>
           <w:u w:val="single"/>
@@ -1992,6 +2030,7 @@
               <w:ind w:left="0" w:firstLine="0"/>
               <w:rPr>
                 <w:b w:val="1"/>
+                <w:bCs w:val="1"/>
                 <w:sz w:val="24"/>
                 <w:szCs w:val="24"/>
                 <w:u w:val="single"/>
@@ -2000,6 +2039,7 @@
             <w:r>
               <w:rPr>
                 <w:b w:val="1"/>
+                <w:bCs w:val="1"/>
                 <w:sz w:val="24"/>
                 <w:szCs w:val="24"/>
                 <w:u w:val="single"/>
@@ -2038,6 +2078,7 @@
               <w:ind w:left="0" w:firstLine="0"/>
               <w:rPr>
                 <w:b w:val="1"/>
+                <w:bCs w:val="1"/>
                 <w:sz w:val="24"/>
                 <w:szCs w:val="24"/>
                 <w:u w:val="single"/>
@@ -2046,6 +2087,7 @@
             <w:r>
               <w:rPr>
                 <w:b w:val="1"/>
+                <w:bCs w:val="1"/>
                 <w:sz w:val="24"/>
                 <w:szCs w:val="24"/>
                 <w:u w:val="single"/>
@@ -2084,6 +2126,7 @@
               <w:ind w:left="0" w:firstLine="0"/>
               <w:rPr>
                 <w:b w:val="1"/>
+                <w:bCs w:val="1"/>
                 <w:sz w:val="24"/>
                 <w:szCs w:val="24"/>
                 <w:u w:val="single"/>
@@ -2092,6 +2135,7 @@
             <w:r>
               <w:rPr>
                 <w:b w:val="1"/>
+                <w:bCs w:val="1"/>
                 <w:sz w:val="24"/>
                 <w:szCs w:val="24"/>
                 <w:u w:val="single"/>
@@ -2130,6 +2174,7 @@
               <w:ind w:left="0" w:firstLine="0"/>
               <w:rPr>
                 <w:b w:val="1"/>
+                <w:bCs w:val="1"/>
                 <w:sz w:val="24"/>
                 <w:szCs w:val="24"/>
                 <w:u w:val="single"/>
@@ -2138,6 +2183,7 @@
             <w:r>
               <w:rPr>
                 <w:b w:val="1"/>
+                <w:bCs w:val="1"/>
                 <w:sz w:val="24"/>
                 <w:szCs w:val="24"/>
                 <w:u w:val="single"/>
@@ -4145,6 +4191,156 @@
           </w:p>
         </w:tc>
       </w:tr>
+      <w:tr>
+        <w:trPr>
+          <w:cantSplit w:val="0"/>
+          <w:trHeight w:val="945" w:hRule="atLeast"/>
+          <w:tblHeader w:val="0"/>
+        </w:trPr>
+        <w:tc>
+          <w:tcPr>
+            <w:shd w:fill="auto" w:val="clear"/>
+            <w:tcMar>
+              <w:top w:w="100.0" w:type="dxa"/>
+              <w:left w:w="100.0" w:type="dxa"/>
+              <w:bottom w:w="100.0" w:type="dxa"/>
+              <w:right w:w="100.0" w:type="dxa"/>
+            </w:tcMar>
+            <w:vAlign w:val="top"/>
+          </w:tcPr>
+          <w:p>
+            <w:pPr>
+              <w:keepNext w:val="0"/>
+              <w:keepLines w:val="0"/>
+              <w:pageBreakBefore w:val="0"/>
+              <w:widowControl w:val="0"/>
+              <w:pBdr>
+                <w:top w:space="0" w:sz="0" w:val="nil"/>
+                <w:left w:space="0" w:sz="0" w:val="nil"/>
+                <w:bottom w:space="0" w:sz="0" w:val="nil"/>
+                <w:right w:space="0" w:sz="0" w:val="nil"/>
+                <w:between w:space="0" w:sz="0" w:val="nil"/>
+              </w:pBdr>
+              <w:shd w:fill="auto" w:val="clear"/>
+              <w:spacing w:after="0" w:before="0" w:line="240" w:lineRule="auto"/>
+              <w:ind w:left="0" w:firstLine="0"/>
+              <w:rPr>
+                <w:sz w:val="24"/>
+                <w:szCs w:val="24"/>
+              </w:rPr>
+            </w:pPr>
+            <w:r>
+              <w:rPr>
+                <w:sz w:val="24"/>
+                <w:szCs w:val="24"/>
+                <w:rtl w:val="0"/>
+              </w:rPr>
+              <w:t xml:space="preserve">3.1</w:t>
+            </w:r>
+          </w:p>
+        </w:tc>
+        <w:tc>
+          <w:tcPr>
+            <w:shd w:fill="auto" w:val="clear"/>
+            <w:tcMar>
+              <w:top w:w="100.0" w:type="dxa"/>
+              <w:left w:w="100.0" w:type="dxa"/>
+              <w:bottom w:w="100.0" w:type="dxa"/>
+              <w:right w:w="100.0" w:type="dxa"/>
+            </w:tcMar>
+            <w:vAlign w:val="top"/>
+          </w:tcPr>
+          <w:p>
+            <w:pPr>
+              <w:keepNext w:val="0"/>
+              <w:keepLines w:val="0"/>
+              <w:pageBreakBefore w:val="0"/>
+              <w:widowControl w:val="0"/>
+              <w:pBdr>
+                <w:top w:space="0" w:sz="0" w:val="nil"/>
+                <w:left w:space="0" w:sz="0" w:val="nil"/>
+                <w:bottom w:space="0" w:sz="0" w:val="nil"/>
+                <w:right w:space="0" w:sz="0" w:val="nil"/>
+                <w:between w:space="0" w:sz="0" w:val="nil"/>
+              </w:pBdr>
+              <w:shd w:fill="auto" w:val="clear"/>
+              <w:spacing w:after="0" w:before="0" w:line="240" w:lineRule="auto"/>
+              <w:ind w:left="0" w:firstLine="0"/>
+              <w:rPr>
+                <w:sz w:val="24"/>
+                <w:szCs w:val="24"/>
+              </w:rPr>
+            </w:pPr>
+            <w:r>
+              <w:rPr>
+                <w:sz w:val="24"/>
+                <w:szCs w:val="24"/>
+                <w:rtl w:val="0"/>
+              </w:rPr>
+              <w:t xml:space="preserve">Bohan Lin</w:t>
+            </w:r>
+          </w:p>
+        </w:tc>
+        <w:tc>
+          <w:tcPr>
+            <w:shd w:fill="auto" w:val="clear"/>
+            <w:tcMar>
+              <w:top w:w="100.0" w:type="dxa"/>
+              <w:left w:w="100.0" w:type="dxa"/>
+              <w:bottom w:w="100.0" w:type="dxa"/>
+              <w:right w:w="100.0" w:type="dxa"/>
+            </w:tcMar>
+            <w:vAlign w:val="top"/>
+          </w:tcPr>
+          <w:p>
+            <w:pPr>
+              <w:widowControl w:val="0"/>
+              <w:spacing w:line="240" w:lineRule="auto"/>
+              <w:rPr>
+                <w:sz w:val="24"/>
+                <w:szCs w:val="24"/>
+              </w:rPr>
+            </w:pPr>
+            <w:r>
+              <w:rPr>
+                <w:sz w:val="24"/>
+                <w:szCs w:val="24"/>
+                <w:rtl w:val="0"/>
+              </w:rPr>
+              <w:t xml:space="preserve">11/22/2025</w:t>
+            </w:r>
+          </w:p>
+        </w:tc>
+        <w:tc>
+          <w:tcPr>
+            <w:shd w:fill="auto" w:val="clear"/>
+            <w:tcMar>
+              <w:top w:w="100.0" w:type="dxa"/>
+              <w:left w:w="100.0" w:type="dxa"/>
+              <w:bottom w:w="100.0" w:type="dxa"/>
+              <w:right w:w="100.0" w:type="dxa"/>
+            </w:tcMar>
+            <w:vAlign w:val="top"/>
+          </w:tcPr>
+          <w:p>
+            <w:pPr>
+              <w:spacing w:before="200" w:line="240" w:lineRule="auto"/>
+              <w:rPr>
+                <w:sz w:val="24"/>
+                <w:szCs w:val="24"/>
+              </w:rPr>
+            </w:pPr>
+            <w:r>
+              <w:rPr>
+                <w:sz w:val="24"/>
+                <w:szCs w:val="24"/>
+                <w:rtl w:val="0"/>
+              </w:rPr>
+              <w:t xml:space="preserve">Security Design</w:t>
+            </w:r>
+          </w:p>
+        </w:tc>
+      </w:tr>
     </w:tbl>
     <w:p>
       <w:pPr>
@@ -4196,7 +4392,7 @@
     </w:p>
     <w:sdt>
       <w:sdtPr>
-        <w:id w:val="-661774794"/>
+        <w:id w:val="335656591"/>
         <w:docPartObj>
           <w:docPartGallery w:val="Table of Contents"/>
           <w:docPartUnique w:val="1"/>
@@ -4210,7 +4406,9 @@
             <w:rPr>
               <w:rFonts w:ascii="Arial" w:cs="Arial" w:eastAsia="Arial" w:hAnsi="Arial"/>
               <w:b w:val="0"/>
+              <w:bCs w:val="0"/>
               <w:i w:val="0"/>
+              <w:iCs w:val="0"/>
               <w:smallCaps w:val="0"/>
               <w:strike w:val="0"/>
               <w:color w:val="1155cc"/>
@@ -4231,7 +4429,9 @@
               <w:rPr>
                 <w:rFonts w:ascii="Arial" w:cs="Arial" w:eastAsia="Arial" w:hAnsi="Arial"/>
                 <w:b w:val="0"/>
+                <w:bCs w:val="0"/>
                 <w:i w:val="0"/>
+                <w:iCs w:val="0"/>
                 <w:smallCaps w:val="0"/>
                 <w:strike w:val="0"/>
                 <w:color w:val="1155cc"/>
@@ -4258,7 +4458,9 @@
             <w:rPr>
               <w:rFonts w:ascii="Arial" w:cs="Arial" w:eastAsia="Arial" w:hAnsi="Arial"/>
               <w:b w:val="0"/>
+              <w:bCs w:val="0"/>
               <w:i w:val="0"/>
+              <w:iCs w:val="0"/>
               <w:smallCaps w:val="0"/>
               <w:strike w:val="0"/>
               <w:color w:val="1155cc"/>
@@ -4274,7 +4476,9 @@
               <w:rPr>
                 <w:rFonts w:ascii="Arial" w:cs="Arial" w:eastAsia="Arial" w:hAnsi="Arial"/>
                 <w:b w:val="0"/>
+                <w:bCs w:val="0"/>
                 <w:i w:val="0"/>
+                <w:iCs w:val="0"/>
                 <w:smallCaps w:val="0"/>
                 <w:strike w:val="0"/>
                 <w:color w:val="1155cc"/>
@@ -4301,7 +4505,9 @@
             <w:rPr>
               <w:rFonts w:ascii="Arial" w:cs="Arial" w:eastAsia="Arial" w:hAnsi="Arial"/>
               <w:b w:val="0"/>
+              <w:bCs w:val="0"/>
               <w:i w:val="0"/>
+              <w:iCs w:val="0"/>
               <w:smallCaps w:val="0"/>
               <w:strike w:val="0"/>
               <w:color w:val="1155cc"/>
@@ -4317,7 +4523,9 @@
               <w:rPr>
                 <w:rFonts w:ascii="Arial" w:cs="Arial" w:eastAsia="Arial" w:hAnsi="Arial"/>
                 <w:b w:val="0"/>
+                <w:bCs w:val="0"/>
                 <w:i w:val="0"/>
+                <w:iCs w:val="0"/>
                 <w:smallCaps w:val="0"/>
                 <w:strike w:val="0"/>
                 <w:color w:val="1155cc"/>
@@ -4344,7 +4552,9 @@
             <w:rPr>
               <w:rFonts w:ascii="Arial" w:cs="Arial" w:eastAsia="Arial" w:hAnsi="Arial"/>
               <w:b w:val="0"/>
+              <w:bCs w:val="0"/>
               <w:i w:val="0"/>
+              <w:iCs w:val="0"/>
               <w:smallCaps w:val="0"/>
               <w:strike w:val="0"/>
               <w:color w:val="1155cc"/>
@@ -4360,7 +4570,9 @@
               <w:rPr>
                 <w:rFonts w:ascii="Arial" w:cs="Arial" w:eastAsia="Arial" w:hAnsi="Arial"/>
                 <w:b w:val="0"/>
+                <w:bCs w:val="0"/>
                 <w:i w:val="0"/>
+                <w:iCs w:val="0"/>
                 <w:smallCaps w:val="0"/>
                 <w:strike w:val="0"/>
                 <w:color w:val="1155cc"/>
@@ -4387,7 +4599,9 @@
             <w:rPr>
               <w:rFonts w:ascii="Arial" w:cs="Arial" w:eastAsia="Arial" w:hAnsi="Arial"/>
               <w:b w:val="0"/>
+              <w:bCs w:val="0"/>
               <w:i w:val="0"/>
+              <w:iCs w:val="0"/>
               <w:smallCaps w:val="0"/>
               <w:strike w:val="0"/>
               <w:color w:val="1155cc"/>
@@ -4403,7 +4617,9 @@
               <w:rPr>
                 <w:rFonts w:ascii="Arial" w:cs="Arial" w:eastAsia="Arial" w:hAnsi="Arial"/>
                 <w:b w:val="0"/>
+                <w:bCs w:val="0"/>
                 <w:i w:val="0"/>
+                <w:iCs w:val="0"/>
                 <w:smallCaps w:val="0"/>
                 <w:strike w:val="0"/>
                 <w:color w:val="1155cc"/>
@@ -4430,7 +4646,9 @@
             <w:rPr>
               <w:rFonts w:ascii="Arial" w:cs="Arial" w:eastAsia="Arial" w:hAnsi="Arial"/>
               <w:b w:val="0"/>
+              <w:bCs w:val="0"/>
               <w:i w:val="0"/>
+              <w:iCs w:val="0"/>
               <w:smallCaps w:val="0"/>
               <w:strike w:val="0"/>
               <w:color w:val="1155cc"/>
@@ -4446,7 +4664,9 @@
               <w:rPr>
                 <w:rFonts w:ascii="Arial" w:cs="Arial" w:eastAsia="Arial" w:hAnsi="Arial"/>
                 <w:b w:val="0"/>
+                <w:bCs w:val="0"/>
                 <w:i w:val="0"/>
+                <w:iCs w:val="0"/>
                 <w:smallCaps w:val="0"/>
                 <w:strike w:val="0"/>
                 <w:color w:val="1155cc"/>
@@ -4473,7 +4693,9 @@
             <w:rPr>
               <w:rFonts w:ascii="Arial" w:cs="Arial" w:eastAsia="Arial" w:hAnsi="Arial"/>
               <w:b w:val="0"/>
+              <w:bCs w:val="0"/>
               <w:i w:val="0"/>
+              <w:iCs w:val="0"/>
               <w:smallCaps w:val="0"/>
               <w:strike w:val="0"/>
               <w:color w:val="1155cc"/>
@@ -4489,7 +4711,9 @@
               <w:rPr>
                 <w:rFonts w:ascii="Arial" w:cs="Arial" w:eastAsia="Arial" w:hAnsi="Arial"/>
                 <w:b w:val="0"/>
+                <w:bCs w:val="0"/>
                 <w:i w:val="0"/>
+                <w:iCs w:val="0"/>
                 <w:smallCaps w:val="0"/>
                 <w:strike w:val="0"/>
                 <w:color w:val="1155cc"/>
@@ -4516,7 +4740,9 @@
             <w:rPr>
               <w:rFonts w:ascii="Arial" w:cs="Arial" w:eastAsia="Arial" w:hAnsi="Arial"/>
               <w:b w:val="0"/>
+              <w:bCs w:val="0"/>
               <w:i w:val="0"/>
+              <w:iCs w:val="0"/>
               <w:smallCaps w:val="0"/>
               <w:strike w:val="0"/>
               <w:color w:val="1155cc"/>
@@ -4532,7 +4758,9 @@
               <w:rPr>
                 <w:rFonts w:ascii="Arial" w:cs="Arial" w:eastAsia="Arial" w:hAnsi="Arial"/>
                 <w:b w:val="0"/>
+                <w:bCs w:val="0"/>
                 <w:i w:val="0"/>
+                <w:iCs w:val="0"/>
                 <w:smallCaps w:val="0"/>
                 <w:strike w:val="0"/>
                 <w:color w:val="1155cc"/>
@@ -4559,7 +4787,9 @@
             <w:rPr>
               <w:rFonts w:ascii="Arial" w:cs="Arial" w:eastAsia="Arial" w:hAnsi="Arial"/>
               <w:b w:val="0"/>
+              <w:bCs w:val="0"/>
               <w:i w:val="0"/>
+              <w:iCs w:val="0"/>
               <w:smallCaps w:val="0"/>
               <w:strike w:val="0"/>
               <w:color w:val="1155cc"/>
@@ -4575,7 +4805,9 @@
               <w:rPr>
                 <w:rFonts w:ascii="Arial" w:cs="Arial" w:eastAsia="Arial" w:hAnsi="Arial"/>
                 <w:b w:val="0"/>
+                <w:bCs w:val="0"/>
                 <w:i w:val="0"/>
+                <w:iCs w:val="0"/>
                 <w:smallCaps w:val="0"/>
                 <w:strike w:val="0"/>
                 <w:color w:val="1155cc"/>
@@ -4602,7 +4834,9 @@
             <w:rPr>
               <w:rFonts w:ascii="Arial" w:cs="Arial" w:eastAsia="Arial" w:hAnsi="Arial"/>
               <w:b w:val="0"/>
+              <w:bCs w:val="0"/>
               <w:i w:val="0"/>
+              <w:iCs w:val="0"/>
               <w:smallCaps w:val="0"/>
               <w:strike w:val="0"/>
               <w:color w:val="1155cc"/>
@@ -4618,7 +4852,9 @@
               <w:rPr>
                 <w:rFonts w:ascii="Arial" w:cs="Arial" w:eastAsia="Arial" w:hAnsi="Arial"/>
                 <w:b w:val="0"/>
+                <w:bCs w:val="0"/>
                 <w:i w:val="0"/>
+                <w:iCs w:val="0"/>
                 <w:smallCaps w:val="0"/>
                 <w:strike w:val="0"/>
                 <w:color w:val="1155cc"/>
@@ -4645,7 +4881,9 @@
             <w:rPr>
               <w:rFonts w:ascii="Arial" w:cs="Arial" w:eastAsia="Arial" w:hAnsi="Arial"/>
               <w:b w:val="0"/>
+              <w:bCs w:val="0"/>
               <w:i w:val="0"/>
+              <w:iCs w:val="0"/>
               <w:smallCaps w:val="0"/>
               <w:strike w:val="0"/>
               <w:color w:val="1155cc"/>
@@ -4661,7 +4899,9 @@
               <w:rPr>
                 <w:rFonts w:ascii="Arial" w:cs="Arial" w:eastAsia="Arial" w:hAnsi="Arial"/>
                 <w:b w:val="0"/>
+                <w:bCs w:val="0"/>
                 <w:i w:val="0"/>
+                <w:iCs w:val="0"/>
                 <w:smallCaps w:val="0"/>
                 <w:strike w:val="0"/>
                 <w:color w:val="1155cc"/>
@@ -4948,6 +5188,7 @@
         <w:ind w:left="720" w:firstLine="0"/>
         <w:rPr>
           <w:b w:val="1"/>
+          <w:bCs w:val="1"/>
           <w:sz w:val="24"/>
           <w:szCs w:val="24"/>
         </w:rPr>
@@ -4955,6 +5196,7 @@
       <w:r>
         <w:rPr>
           <w:b w:val="1"/>
+          <w:bCs w:val="1"/>
           <w:sz w:val="24"/>
           <w:szCs w:val="24"/>
           <w:rtl w:val="0"/>
@@ -4984,12 +5226,12 @@
           <wp:inline distB="114300" distT="114300" distL="114300" distR="114300">
             <wp:extent cx="5943600" cy="2819400"/>
             <wp:effectExtent b="0" l="0" r="0" t="0"/>
-            <wp:docPr id="4" name="image8.png"/>
+            <wp:docPr id="7" name="image6.png"/>
             <a:graphic>
               <a:graphicData uri="http://schemas.openxmlformats.org/drawingml/2006/picture">
                 <pic:pic>
                   <pic:nvPicPr>
-                    <pic:cNvPr id="0" name="image8.png"/>
+                    <pic:cNvPr id="0" name="image6.png"/>
                     <pic:cNvPicPr preferRelativeResize="0"/>
                   </pic:nvPicPr>
                   <pic:blipFill>
@@ -5024,11 +5266,13 @@
         <w:ind w:left="720" w:firstLine="0"/>
         <w:rPr>
           <w:b w:val="1"/>
+          <w:bCs w:val="1"/>
         </w:rPr>
       </w:pPr>
       <w:r>
         <w:rPr>
           <w:b w:val="1"/>
+          <w:bCs w:val="1"/>
           <w:rtl w:val="0"/>
         </w:rPr>
         <w:t xml:space="preserve">User</w:t>
@@ -5074,11 +5318,13 @@
         <w:ind w:left="720" w:firstLine="0"/>
         <w:rPr>
           <w:b w:val="1"/>
+          <w:bCs w:val="1"/>
         </w:rPr>
       </w:pPr>
       <w:r>
         <w:rPr>
           <w:b w:val="1"/>
+          <w:bCs w:val="1"/>
           <w:rtl w:val="0"/>
         </w:rPr>
         <w:t xml:space="preserve">Profile</w:t>
@@ -5124,11 +5370,13 @@
         <w:ind w:left="720" w:firstLine="0"/>
         <w:rPr>
           <w:b w:val="1"/>
+          <w:bCs w:val="1"/>
         </w:rPr>
       </w:pPr>
       <w:r>
         <w:rPr>
           <w:b w:val="1"/>
+          <w:bCs w:val="1"/>
           <w:rtl w:val="0"/>
         </w:rPr>
         <w:t xml:space="preserve">Settings</w:t>
@@ -5174,11 +5422,13 @@
         <w:ind w:left="720" w:firstLine="0"/>
         <w:rPr>
           <w:b w:val="1"/>
+          <w:bCs w:val="1"/>
         </w:rPr>
       </w:pPr>
       <w:r>
         <w:rPr>
           <w:b w:val="1"/>
+          <w:bCs w:val="1"/>
           <w:rtl w:val="0"/>
         </w:rPr>
         <w:t xml:space="preserve">StudySession</w:t>
@@ -5224,11 +5474,13 @@
         <w:ind w:left="720" w:firstLine="0"/>
         <w:rPr>
           <w:b w:val="1"/>
+          <w:bCs w:val="1"/>
         </w:rPr>
       </w:pPr>
       <w:r>
         <w:rPr>
           <w:b w:val="1"/>
+          <w:bCs w:val="1"/>
           <w:rtl w:val="0"/>
         </w:rPr>
         <w:t xml:space="preserve">StudyBuddyPet</w:t>
@@ -5263,6 +5515,7 @@
         <w:ind w:left="720" w:firstLine="0"/>
         <w:rPr>
           <w:b w:val="1"/>
+          <w:bCs w:val="1"/>
           <w:sz w:val="24"/>
           <w:szCs w:val="24"/>
         </w:rPr>
@@ -5278,6 +5531,7 @@
         <w:ind w:left="720" w:firstLine="0"/>
         <w:rPr>
           <w:b w:val="1"/>
+          <w:bCs w:val="1"/>
           <w:sz w:val="24"/>
           <w:szCs w:val="24"/>
         </w:rPr>
@@ -5285,6 +5539,7 @@
       <w:r>
         <w:rPr>
           <w:b w:val="1"/>
+          <w:bCs w:val="1"/>
           <w:sz w:val="24"/>
           <w:szCs w:val="24"/>
           <w:rtl w:val="0"/>
@@ -5303,12 +5558,12 @@
           <wp:inline distB="114300" distT="114300" distL="114300" distR="114300">
             <wp:extent cx="5943600" cy="2667000"/>
             <wp:effectExtent b="0" l="0" r="0" t="0"/>
-            <wp:docPr id="3" name="image9.png"/>
+            <wp:docPr id="6" name="image7.png"/>
             <a:graphic>
               <a:graphicData uri="http://schemas.openxmlformats.org/drawingml/2006/picture">
                 <pic:pic>
                   <pic:nvPicPr>
-                    <pic:cNvPr id="0" name="image9.png"/>
+                    <pic:cNvPr id="0" name="image7.png"/>
                     <pic:cNvPicPr preferRelativeResize="0"/>
                   </pic:nvPicPr>
                   <pic:blipFill>
@@ -5365,11 +5620,13 @@
         <w:ind w:left="720" w:firstLine="0"/>
         <w:rPr>
           <w:b w:val="1"/>
+          <w:bCs w:val="1"/>
         </w:rPr>
       </w:pPr>
       <w:r>
         <w:rPr>
           <w:b w:val="1"/>
+          <w:bCs w:val="1"/>
           <w:rtl w:val="0"/>
         </w:rPr>
         <w:t xml:space="preserve">App shell &amp; navigation</w:t>
@@ -5603,11 +5860,13 @@
         <w:ind w:left="720" w:firstLine="0"/>
         <w:rPr>
           <w:b w:val="1"/>
+          <w:bCs w:val="1"/>
         </w:rPr>
       </w:pPr>
       <w:r>
         <w:rPr>
           <w:b w:val="1"/>
+          <w:bCs w:val="1"/>
           <w:rtl w:val="0"/>
         </w:rPr>
         <w:t xml:space="preserve">Screens package (screens/)</w:t>
@@ -6323,11 +6582,13 @@
         <w:ind w:left="720" w:firstLine="0"/>
         <w:rPr>
           <w:b w:val="1"/>
+          <w:bCs w:val="1"/>
         </w:rPr>
       </w:pPr>
       <w:r>
         <w:rPr>
           <w:b w:val="1"/>
+          <w:bCs w:val="1"/>
           <w:rtl w:val="0"/>
         </w:rPr>
         <w:t xml:space="preserve">Reusable UI components (components/)</w:t>
@@ -6860,6 +7121,7 @@
       <w:r>
         <w:rPr>
           <w:b w:val="1"/>
+          <w:bCs w:val="1"/>
           <w:rtl w:val="0"/>
         </w:rPr>
         <w:t xml:space="preserve">Users </w:t>
@@ -6873,6 +7135,7 @@
       <w:r>
         <w:rPr>
           <w:i w:val="1"/>
+          <w:iCs w:val="1"/>
           <w:rtl w:val="0"/>
         </w:rPr>
         <w:t xml:space="preserve">id </w:t>
@@ -6886,6 +7149,7 @@
       <w:r>
         <w:rPr>
           <w:i w:val="1"/>
+          <w:iCs w:val="1"/>
           <w:rtl w:val="0"/>
         </w:rPr>
         <w:t xml:space="preserve">username</w:t>
@@ -6926,6 +7190,7 @@
       <w:r>
         <w:rPr>
           <w:b w:val="1"/>
+          <w:bCs w:val="1"/>
           <w:rtl w:val="0"/>
         </w:rPr>
         <w:t xml:space="preserve">Profile</w:t>
@@ -6966,6 +7231,7 @@
       <w:r>
         <w:rPr>
           <w:b w:val="1"/>
+          <w:bCs w:val="1"/>
           <w:rtl w:val="0"/>
         </w:rPr>
         <w:t xml:space="preserve">Settings </w:t>
@@ -7006,6 +7272,7 @@
       <w:r>
         <w:rPr>
           <w:b w:val="1"/>
+          <w:bCs w:val="1"/>
           <w:rtl w:val="0"/>
         </w:rPr>
         <w:t xml:space="preserve">Study Sessions</w:t>
@@ -7087,20 +7354,7 @@
         <w:rPr>
           <w:rtl w:val="0"/>
         </w:rPr>
-        <w:t xml:space="preserve">The current system adopts a </w:t>
-      </w:r>
-      <w:r>
-        <w:rPr>
-          <w:b w:val="1"/>
-          <w:rtl w:val="0"/>
-        </w:rPr>
-        <w:t xml:space="preserve">local login and data storage approach</w:t>
-      </w:r>
-      <w:r>
-        <w:rPr>
-          <w:rtl w:val="0"/>
-        </w:rPr>
-        <w:t xml:space="preserve">, which helps minimize the risk of data leakage and unauthorized access. Since all user interactions and validations occur locally, no sensitive information is transmitted to external servers. This design ensures a safer environment during the prototype and development phases.</w:t>
+        <w:t xml:space="preserve">Our Study Buddy App is designed with security built in to support core goals of confidentiality, integrity, availability (CIA) and IAAA controls (identification, authentication, authorization, accountability). During registration, each user is uniquely identified by their username, and passwords are never stored in plain text. Instead, we use bcrypt with a per-user salt and an appropriate cost factor to hash password, making offline cracking significantly more difficult. On the frontend, we enforce password constraints (e.g., minimum length and complexity rules) to reduce weak-password and brute-force risks. All communication between the frontend and backend is sent over HTTPS to protect credentials and other sensitive data in transit. After a successful login, the server issues a signed JSON Web Token (JWT) that encodes the user’s ID and role; this token has a limited lifetime and is validated on every request to provide stateless authentication and simple role-based access control. Sensitive data is never stored inside the JWT payload, and token expiration on logout reduces the risk of token reuse.</w:t>
       </w:r>
     </w:p>
     <w:p>
@@ -7212,6 +7466,7 @@
       <w:r>
         <w:rPr>
           <w:i w:val="1"/>
+          <w:iCs w:val="1"/>
           <w:rtl w:val="0"/>
         </w:rPr>
         <w:t xml:space="preserve">isRunning</w:t>
@@ -7404,12 +7659,12 @@
           <wp:inline distB="114300" distT="114300" distL="114300" distR="114300">
             <wp:extent cx="4405313" cy="3333263"/>
             <wp:effectExtent b="0" l="0" r="0" t="0"/>
-            <wp:docPr id="6" name="image5.png"/>
+            <wp:docPr id="9" name="image8.png"/>
             <a:graphic>
               <a:graphicData uri="http://schemas.openxmlformats.org/drawingml/2006/picture">
                 <pic:pic>
                   <pic:nvPicPr>
-                    <pic:cNvPr id="0" name="image5.png"/>
+                    <pic:cNvPr id="0" name="image8.png"/>
                     <pic:cNvPicPr preferRelativeResize="0"/>
                   </pic:nvPicPr>
                   <pic:blipFill>
@@ -8264,12 +8519,12 @@
           <wp:inline distB="114300" distT="114300" distL="114300" distR="114300">
             <wp:extent cx="5519738" cy="1105717"/>
             <wp:effectExtent b="0" l="0" r="0" t="0"/>
-            <wp:docPr id="1" name="image2.png"/>
+            <wp:docPr id="2" name="image9.png"/>
             <a:graphic>
               <a:graphicData uri="http://schemas.openxmlformats.org/drawingml/2006/picture">
                 <pic:pic>
                   <pic:nvPicPr>
-                    <pic:cNvPr id="0" name="image2.png"/>
+                    <pic:cNvPr id="0" name="image9.png"/>
                     <pic:cNvPicPr preferRelativeResize="0"/>
                   </pic:nvPicPr>
                   <pic:blipFill>
@@ -8383,6 +8638,7 @@
       <w:r>
         <w:rPr>
           <w:i w:val="1"/>
+          <w:iCs w:val="1"/>
           <w:rtl w:val="0"/>
         </w:rPr>
         <w:t xml:space="preserve">StudySessions</w:t>
@@ -8703,6 +8959,7 @@
       <w:r>
         <w:rPr>
           <w:i w:val="1"/>
+          <w:iCs w:val="1"/>
           <w:rtl w:val="0"/>
         </w:rPr>
         <w:t xml:space="preserve">StudySessions</w:t>
@@ -8764,7 +9021,7 @@
           <wp:inline distB="114300" distT="114300" distL="114300" distR="114300">
             <wp:extent cx="4452938" cy="627978"/>
             <wp:effectExtent b="0" l="0" r="0" t="0"/>
-            <wp:docPr id="5" name="image3.png"/>
+            <wp:docPr id="8" name="image3.png"/>
             <a:graphic>
               <a:graphicData uri="http://schemas.openxmlformats.org/drawingml/2006/picture">
                 <pic:pic>
@@ -9230,7 +9487,7 @@
           <wp:inline distB="114300" distT="114300" distL="114300" distR="114300">
             <wp:extent cx="4491038" cy="546332"/>
             <wp:effectExtent b="0" l="0" r="0" t="0"/>
-            <wp:docPr id="2" name="image10.png"/>
+            <wp:docPr id="4" name="image10.png"/>
             <a:graphic>
               <a:graphicData uri="http://schemas.openxmlformats.org/drawingml/2006/picture">
                 <pic:pic>
@@ -9499,12 +9756,12 @@
           <wp:inline distB="114300" distT="114300" distL="114300" distR="114300">
             <wp:extent cx="4346144" cy="2614613"/>
             <wp:effectExtent b="0" l="0" r="0" t="0"/>
-            <wp:docPr id="8" name="image1.png"/>
+            <wp:docPr id="1" name="image2.png"/>
             <a:graphic>
               <a:graphicData uri="http://schemas.openxmlformats.org/drawingml/2006/picture">
                 <pic:pic>
                   <pic:nvPicPr>
-                    <pic:cNvPr id="0" name="image1.png"/>
+                    <pic:cNvPr id="0" name="image2.png"/>
                     <pic:cNvPicPr preferRelativeResize="0"/>
                   </pic:nvPicPr>
                   <pic:blipFill>
@@ -10086,6 +10343,7 @@
       <w:r>
         <w:rPr>
           <w:i w:val="1"/>
+          <w:iCs w:val="1"/>
           <w:rtl w:val="0"/>
         </w:rPr>
         <w:t xml:space="preserve">onPressUp</w:t>
@@ -10148,12 +10406,12 @@
           <wp:inline distB="114300" distT="114300" distL="114300" distR="114300">
             <wp:extent cx="4395788" cy="563563"/>
             <wp:effectExtent b="0" l="0" r="0" t="0"/>
-            <wp:docPr id="9" name="image7.png"/>
+            <wp:docPr id="3" name="image1.png"/>
             <a:graphic>
               <a:graphicData uri="http://schemas.openxmlformats.org/drawingml/2006/picture">
                 <pic:pic>
                   <pic:nvPicPr>
-                    <pic:cNvPr id="0" name="image7.png"/>
+                    <pic:cNvPr id="0" name="image1.png"/>
                     <pic:cNvPicPr preferRelativeResize="0"/>
                   </pic:nvPicPr>
                   <pic:blipFill>
@@ -10653,7 +10911,7 @@
           <wp:inline distB="114300" distT="114300" distL="114300" distR="114300">
             <wp:extent cx="5427071" cy="1509713"/>
             <wp:effectExtent b="0" l="0" r="0" t="0"/>
-            <wp:docPr id="7" name="image4.png"/>
+            <wp:docPr id="10" name="image4.png"/>
             <a:graphic>
               <a:graphicData uri="http://schemas.openxmlformats.org/drawingml/2006/picture">
                 <pic:pic>
@@ -10754,6 +11012,7 @@
       <w:r>
         <w:rPr>
           <w:b w:val="1"/>
+          <w:bCs w:val="1"/>
           <w:rtl w:val="0"/>
         </w:rPr>
         <w:t xml:space="preserve">1. MVC Pattern</w:t>
@@ -10776,6 +11035,7 @@
       <w:r>
         <w:rPr>
           <w:b w:val="1"/>
+          <w:bCs w:val="1"/>
           <w:rtl w:val="0"/>
         </w:rPr>
         <w:t xml:space="preserve">Models</w:t>
@@ -10840,6 +11100,7 @@
       <w:r>
         <w:rPr>
           <w:b w:val="1"/>
+          <w:bCs w:val="1"/>
           <w:rtl w:val="0"/>
         </w:rPr>
         <w:t xml:space="preserve">Controllers / Routes</w:t>
@@ -10904,6 +11165,7 @@
       <w:r>
         <w:rPr>
           <w:b w:val="1"/>
+          <w:bCs w:val="1"/>
           <w:rtl w:val="0"/>
         </w:rPr>
         <w:t xml:space="preserve">Views</w:t>
@@ -10927,6 +11189,7 @@
       <w:r>
         <w:rPr>
           <w:b w:val="1"/>
+          <w:bCs w:val="1"/>
           <w:rtl w:val="0"/>
         </w:rPr>
         <w:t xml:space="preserve">2. Middleware Pattern</w:t>
@@ -11061,6 +11324,7 @@
       <w:r>
         <w:rPr>
           <w:b w:val="1"/>
+          <w:bCs w:val="1"/>
           <w:rtl w:val="0"/>
         </w:rPr>
         <w:t xml:space="preserve">3. Singleton &amp; Modular Configuration Pattern</w:t>
@@ -11112,6 +11376,7 @@
       <w:r>
         <w:rPr>
           <w:b w:val="1"/>
+          <w:bCs w:val="1"/>
           <w:rtl w:val="0"/>
         </w:rPr>
         <w:t xml:space="preserve">4. RESTful API Design Pattern</w:t>
@@ -16128,6 +16393,7 @@
     <w:rPr>
       <w:rFonts w:ascii="Trebuchet MS" w:cs="Trebuchet MS" w:eastAsia="Trebuchet MS" w:hAnsi="Trebuchet MS"/>
       <w:b w:val="1"/>
+      <w:bCs w:val="1"/>
       <w:sz w:val="26"/>
       <w:szCs w:val="26"/>
     </w:rPr>
@@ -16145,6 +16411,7 @@
     <w:rPr>
       <w:rFonts w:ascii="Trebuchet MS" w:cs="Trebuchet MS" w:eastAsia="Trebuchet MS" w:hAnsi="Trebuchet MS"/>
       <w:b w:val="1"/>
+      <w:bCs w:val="1"/>
       <w:color w:val="666666"/>
       <w:sz w:val="24"/>
       <w:szCs w:val="24"/>
@@ -16198,6 +16465,7 @@
     <w:rPr>
       <w:rFonts w:ascii="Trebuchet MS" w:cs="Trebuchet MS" w:eastAsia="Trebuchet MS" w:hAnsi="Trebuchet MS"/>
       <w:i w:val="1"/>
+      <w:iCs w:val="1"/>
       <w:color w:val="666666"/>
       <w:sz w:val="22"/>
       <w:szCs w:val="22"/>
@@ -16232,6 +16500,7 @@
     <w:rPr>
       <w:rFonts w:ascii="Trebuchet MS" w:cs="Trebuchet MS" w:eastAsia="Trebuchet MS" w:hAnsi="Trebuchet MS"/>
       <w:i w:val="1"/>
+      <w:iCs w:val="1"/>
       <w:color w:val="666666"/>
       <w:sz w:val="26"/>
       <w:szCs w:val="26"/>

</xml_diff>